<commit_message>
changes files and dates format
</commit_message>
<xml_diff>
--- a/estimate_template.docx
+++ b/estimate_template.docx
@@ -1480,16 +1480,7 @@
                 <w:szCs w:val="16"/>
                 <w:lang w:val="en-US"/>
               </w:rPr>
-              <w:t>requests</w:t>
-            </w:r>
-            <w:r>
-              <w:rPr>
-                <w:rFonts w:ascii="Open Sans" w:eastAsia="Aptos" w:hAnsi="Open Sans" w:cs="Open Sans"/>
-                <w:sz w:val="16"/>
-                <w:szCs w:val="16"/>
-                <w:lang w:val="en-US"/>
-              </w:rPr>
-              <w:t xml:space="preserve"> </w:t>
+              <w:t xml:space="preserve">requests </w:t>
             </w:r>
             <w:r>
               <w:rPr>
@@ -1966,6 +1957,7 @@
                 <w:lang w:val="en-US"/>
               </w:rPr>
             </w:pPr>
+            <w:proofErr w:type="gramStart"/>
             <w:r>
               <w:rPr>
                 <w:rFonts w:ascii="Open Sans" w:eastAsia="Aptos" w:hAnsi="Open Sans" w:cs="Open Sans"/>
@@ -1984,7 +1976,17 @@
                 <w:szCs w:val="16"/>
                 <w:lang w:val="en-US"/>
               </w:rPr>
-              <w:t>:___________________________________</w:t>
+              <w:t>:_</w:t>
+            </w:r>
+            <w:proofErr w:type="gramEnd"/>
+            <w:r>
+              <w:rPr>
+                <w:rFonts w:ascii="Open Sans" w:eastAsia="Aptos" w:hAnsi="Open Sans" w:cs="Open Sans"/>
+                <w:sz w:val="16"/>
+                <w:szCs w:val="16"/>
+                <w:lang w:val="en-US"/>
+              </w:rPr>
+              <w:t>__________________________________</w:t>
             </w:r>
             <w:r>
               <w:rPr>
@@ -1995,7 +1997,31 @@
                 <w:szCs w:val="16"/>
                 <w:lang w:val="en-US"/>
               </w:rPr>
-              <w:t xml:space="preserve"> Name:____________________________________</w:t>
+              <w:t xml:space="preserve"> </w:t>
+            </w:r>
+            <w:proofErr w:type="gramStart"/>
+            <w:r>
+              <w:rPr>
+                <w:rFonts w:ascii="Open Sans" w:eastAsia="Aptos" w:hAnsi="Open Sans" w:cs="Open Sans"/>
+                <w:b/>
+                <w:bCs/>
+                <w:sz w:val="16"/>
+                <w:szCs w:val="16"/>
+                <w:lang w:val="en-US"/>
+              </w:rPr>
+              <w:t>Name:_</w:t>
+            </w:r>
+            <w:proofErr w:type="gramEnd"/>
+            <w:r>
+              <w:rPr>
+                <w:rFonts w:ascii="Open Sans" w:eastAsia="Aptos" w:hAnsi="Open Sans" w:cs="Open Sans"/>
+                <w:b/>
+                <w:bCs/>
+                <w:sz w:val="16"/>
+                <w:szCs w:val="16"/>
+                <w:lang w:val="en-US"/>
+              </w:rPr>
+              <w:t>___________________________________</w:t>
             </w:r>
           </w:p>
           <w:p>
@@ -2126,7 +2152,6 @@
                 <w:szCs w:val="16"/>
                 <w:lang w:val="en-US"/>
               </w:rPr>
-              <w:lastRenderedPageBreak/>
               <w:t>Foodesign Conceptual Events Policies</w:t>
             </w:r>
           </w:p>
@@ -2159,7 +2184,16 @@
                 <w:szCs w:val="16"/>
                 <w:lang w:val="en-US"/>
               </w:rPr>
-              <w:t>The fees and pricing quoted in this proposal are estimates based on the client’s guaranteed minimum guest count and guaranteed time duration. If more guests are served or the caterer’s services are needed for additional time not included in the client’s estimated duration, the caterer reserves the right to charge a fair price for the additional food, drink, labor and services required. If fewer guests attend or less time is needed, the caterer will still be paid according to the guaranteed minimum guest count and time duration.</w:t>
+              <w:t>The fees and pricing quoted in this proposal are estimates based on the client’s guaranteed minimum guest count and guaranteed time duration. If more guests are served or the caterer’s services are needed for additional time not included in the client’s estimated duration, the caterer reserves the right to charge a fair price for the additional food, drink, labor and services required. If fewer guests attend or less time is needed, the caterer will still be paid according to the guaranteed minimum guest cou</w:t>
+            </w:r>
+            <w:r>
+              <w:rPr>
+                <w:rFonts w:ascii="Open Sans" w:eastAsia="Aptos" w:hAnsi="Open Sans" w:cs="Open Sans"/>
+                <w:sz w:val="16"/>
+                <w:szCs w:val="16"/>
+                <w:lang w:val="en-US"/>
+              </w:rPr>
+              <w:t>nt and time duration.</w:t>
             </w:r>
           </w:p>
           <w:p>
@@ -2529,8 +2563,12 @@
       </w:pPr>
     </w:p>
     <w:sectPr>
-      <w:headerReference w:type="default" r:id="rId9"/>
-      <w:footerReference w:type="default" r:id="rId10"/>
+      <w:headerReference w:type="even" r:id="rId9"/>
+      <w:headerReference w:type="default" r:id="rId10"/>
+      <w:footerReference w:type="even" r:id="rId11"/>
+      <w:footerReference w:type="default" r:id="rId12"/>
+      <w:headerReference w:type="first" r:id="rId13"/>
+      <w:footerReference w:type="first" r:id="rId14"/>
       <w:pgSz w:w="12240" w:h="15840"/>
       <w:pgMar w:top="2880" w:right="2261" w:bottom="1123" w:left="2261" w:header="576" w:footer="706" w:gutter="0"/>
       <w:cols w:space="720"/>
@@ -2568,6 +2606,16 @@
 </file>
 
 <file path=word/footer1.xml><?xml version="1.0" encoding="utf-8"?>
+<w:ftr xmlns:wpc="http://schemas.microsoft.com/office/word/2010/wordprocessingCanvas" xmlns:cx="http://schemas.microsoft.com/office/drawing/2014/chartex" xmlns:cx1="http://schemas.microsoft.com/office/drawing/2015/9/8/chartex" xmlns:cx2="http://schemas.microsoft.com/office/drawing/2015/10/21/chartex" xmlns:cx3="http://schemas.microsoft.com/office/drawing/2016/5/9/chartex" xmlns:cx4="http://schemas.microsoft.com/office/drawing/2016/5/10/chartex" xmlns:cx5="http://schemas.microsoft.com/office/drawing/2016/5/11/chartex" xmlns:cx6="http://schemas.microsoft.com/office/drawing/2016/5/12/chartex" xmlns:cx7="http://schemas.microsoft.com/office/drawing/2016/5/13/chartex" xmlns:cx8="http://schemas.microsoft.com/office/drawing/2016/5/14/chartex" xmlns:mc="http://schemas.openxmlformats.org/markup-compatibility/2006" xmlns:aink="http://schemas.microsoft.com/office/drawing/2016/ink" xmlns:am3d="http://schemas.microsoft.com/office/drawing/2017/model3d" xmlns:o="urn:schemas-microsoft-com:office:office" xmlns:oel="http://schemas.microsoft.com/office/2019/extlst" xmlns:r="http://schemas.openxmlformats.org/officeDocument/2006/relationships" xmlns:m="http://schemas.openxmlformats.org/officeDocument/2006/math" xmlns:v="urn:schemas-microsoft-com:vml" xmlns:wp14="http://schemas.microsoft.com/office/word/2010/wordprocessingDrawing" xmlns:wp="http://schemas.openxmlformats.org/drawingml/2006/wordprocessingDrawing" xmlns:w10="urn:schemas-microsoft-com:office:word" xmlns:w="http://schemas.openxmlformats.org/wordprocessingml/2006/main" xmlns:w14="http://schemas.microsoft.com/office/word/2010/wordml" xmlns:w15="http://schemas.microsoft.com/office/word/2012/wordml" xmlns:w16cex="http://schemas.microsoft.com/office/word/2018/wordml/cex" xmlns:w16cid="http://schemas.microsoft.com/office/word/2016/wordml/cid" xmlns:w16="http://schemas.microsoft.com/office/word/2018/wordml" xmlns:w16du="http://schemas.microsoft.com/office/word/2023/wordml/word16du" xmlns:w16sdtdh="http://schemas.microsoft.com/office/word/2020/wordml/sdtdatahash" xmlns:w16sdtfl="http://schemas.microsoft.com/office/word/2024/wordml/sdtformatlock" xmlns:w16se="http://schemas.microsoft.com/office/word/2015/wordml/symex" xmlns:wpg="http://schemas.microsoft.com/office/word/2010/wordprocessingGroup" xmlns:wpi="http://schemas.microsoft.com/office/word/2010/wordprocessingInk" xmlns:wne="http://schemas.microsoft.com/office/word/2006/wordml" xmlns:wps="http://schemas.microsoft.com/office/word/2010/wordprocessingShape" mc:Ignorable="w14 w15 w16se w16cid w16 w16cex w16sdtdh w16sdtfl w16du wp14">
+  <w:p>
+    <w:pPr>
+      <w:pStyle w:val="Piedepgina"/>
+    </w:pPr>
+  </w:p>
+</w:ftr>
+</file>
+
+<file path=word/footer2.xml><?xml version="1.0" encoding="utf-8"?>
 <w:ftr xmlns:wpc="http://schemas.microsoft.com/office/word/2010/wordprocessingCanvas" xmlns:cx="http://schemas.microsoft.com/office/drawing/2014/chartex" xmlns:cx1="http://schemas.microsoft.com/office/drawing/2015/9/8/chartex" xmlns:cx2="http://schemas.microsoft.com/office/drawing/2015/10/21/chartex" xmlns:cx3="http://schemas.microsoft.com/office/drawing/2016/5/9/chartex" xmlns:cx4="http://schemas.microsoft.com/office/drawing/2016/5/10/chartex" xmlns:cx5="http://schemas.microsoft.com/office/drawing/2016/5/11/chartex" xmlns:cx6="http://schemas.microsoft.com/office/drawing/2016/5/12/chartex" xmlns:cx7="http://schemas.microsoft.com/office/drawing/2016/5/13/chartex" xmlns:cx8="http://schemas.microsoft.com/office/drawing/2016/5/14/chartex" xmlns:mc="http://schemas.openxmlformats.org/markup-compatibility/2006" xmlns:aink="http://schemas.microsoft.com/office/drawing/2016/ink" xmlns:am3d="http://schemas.microsoft.com/office/drawing/2017/model3d" xmlns:o="urn:schemas-microsoft-com:office:office" xmlns:oel="http://schemas.microsoft.com/office/2019/extlst" xmlns:r="http://schemas.openxmlformats.org/officeDocument/2006/relationships" xmlns:m="http://schemas.openxmlformats.org/officeDocument/2006/math" xmlns:v="urn:schemas-microsoft-com:vml" xmlns:wp14="http://schemas.microsoft.com/office/word/2010/wordprocessingDrawing" xmlns:wp="http://schemas.openxmlformats.org/drawingml/2006/wordprocessingDrawing" xmlns:w10="urn:schemas-microsoft-com:office:word" xmlns:w="http://schemas.openxmlformats.org/wordprocessingml/2006/main" xmlns:w14="http://schemas.microsoft.com/office/word/2010/wordml" xmlns:w15="http://schemas.microsoft.com/office/word/2012/wordml" xmlns:w16cex="http://schemas.microsoft.com/office/word/2018/wordml/cex" xmlns:w16cid="http://schemas.microsoft.com/office/word/2016/wordml/cid" xmlns:w16="http://schemas.microsoft.com/office/word/2018/wordml" xmlns:w16du="http://schemas.microsoft.com/office/word/2023/wordml/word16du" xmlns:w16sdtdh="http://schemas.microsoft.com/office/word/2020/wordml/sdtdatahash" xmlns:w16sdtfl="http://schemas.microsoft.com/office/word/2024/wordml/sdtformatlock" xmlns:w16se="http://schemas.microsoft.com/office/word/2015/wordml/symex" xmlns:wpg="http://schemas.microsoft.com/office/word/2010/wordprocessingGroup" xmlns:wpi="http://schemas.microsoft.com/office/word/2010/wordprocessingInk" xmlns:wne="http://schemas.microsoft.com/office/word/2006/wordml" xmlns:wps="http://schemas.microsoft.com/office/word/2010/wordprocessingShape" mc:Ignorable="w14 w15 w16se w16cid w16 w16cex w16sdtdh w16sdtfl w16du wp14">
   <w:p>
     <w:pPr>
@@ -2869,6 +2917,16 @@
 </w:ftr>
 </file>
 
+<file path=word/footer3.xml><?xml version="1.0" encoding="utf-8"?>
+<w:ftr xmlns:wpc="http://schemas.microsoft.com/office/word/2010/wordprocessingCanvas" xmlns:cx="http://schemas.microsoft.com/office/drawing/2014/chartex" xmlns:cx1="http://schemas.microsoft.com/office/drawing/2015/9/8/chartex" xmlns:cx2="http://schemas.microsoft.com/office/drawing/2015/10/21/chartex" xmlns:cx3="http://schemas.microsoft.com/office/drawing/2016/5/9/chartex" xmlns:cx4="http://schemas.microsoft.com/office/drawing/2016/5/10/chartex" xmlns:cx5="http://schemas.microsoft.com/office/drawing/2016/5/11/chartex" xmlns:cx6="http://schemas.microsoft.com/office/drawing/2016/5/12/chartex" xmlns:cx7="http://schemas.microsoft.com/office/drawing/2016/5/13/chartex" xmlns:cx8="http://schemas.microsoft.com/office/drawing/2016/5/14/chartex" xmlns:mc="http://schemas.openxmlformats.org/markup-compatibility/2006" xmlns:aink="http://schemas.microsoft.com/office/drawing/2016/ink" xmlns:am3d="http://schemas.microsoft.com/office/drawing/2017/model3d" xmlns:o="urn:schemas-microsoft-com:office:office" xmlns:oel="http://schemas.microsoft.com/office/2019/extlst" xmlns:r="http://schemas.openxmlformats.org/officeDocument/2006/relationships" xmlns:m="http://schemas.openxmlformats.org/officeDocument/2006/math" xmlns:v="urn:schemas-microsoft-com:vml" xmlns:wp14="http://schemas.microsoft.com/office/word/2010/wordprocessingDrawing" xmlns:wp="http://schemas.openxmlformats.org/drawingml/2006/wordprocessingDrawing" xmlns:w10="urn:schemas-microsoft-com:office:word" xmlns:w="http://schemas.openxmlformats.org/wordprocessingml/2006/main" xmlns:w14="http://schemas.microsoft.com/office/word/2010/wordml" xmlns:w15="http://schemas.microsoft.com/office/word/2012/wordml" xmlns:w16cex="http://schemas.microsoft.com/office/word/2018/wordml/cex" xmlns:w16cid="http://schemas.microsoft.com/office/word/2016/wordml/cid" xmlns:w16="http://schemas.microsoft.com/office/word/2018/wordml" xmlns:w16du="http://schemas.microsoft.com/office/word/2023/wordml/word16du" xmlns:w16sdtdh="http://schemas.microsoft.com/office/word/2020/wordml/sdtdatahash" xmlns:w16sdtfl="http://schemas.microsoft.com/office/word/2024/wordml/sdtformatlock" xmlns:w16se="http://schemas.microsoft.com/office/word/2015/wordml/symex" xmlns:wpg="http://schemas.microsoft.com/office/word/2010/wordprocessingGroup" xmlns:wpi="http://schemas.microsoft.com/office/word/2010/wordprocessingInk" xmlns:wne="http://schemas.microsoft.com/office/word/2006/wordml" xmlns:wps="http://schemas.microsoft.com/office/word/2010/wordprocessingShape" mc:Ignorable="w14 w15 w16se w16cid w16 w16cex w16sdtdh w16sdtfl w16du wp14">
+  <w:p>
+    <w:pPr>
+      <w:pStyle w:val="Piedepgina"/>
+    </w:pPr>
+  </w:p>
+</w:ftr>
+</file>
+
 <file path=word/footnotes.xml><?xml version="1.0" encoding="utf-8"?>
 <w:footnotes xmlns:wpc="http://schemas.microsoft.com/office/word/2010/wordprocessingCanvas" xmlns:cx="http://schemas.microsoft.com/office/drawing/2014/chartex" xmlns:cx1="http://schemas.microsoft.com/office/drawing/2015/9/8/chartex" xmlns:cx2="http://schemas.microsoft.com/office/drawing/2015/10/21/chartex" xmlns:cx3="http://schemas.microsoft.com/office/drawing/2016/5/9/chartex" xmlns:cx4="http://schemas.microsoft.com/office/drawing/2016/5/10/chartex" xmlns:cx5="http://schemas.microsoft.com/office/drawing/2016/5/11/chartex" xmlns:cx6="http://schemas.microsoft.com/office/drawing/2016/5/12/chartex" xmlns:cx7="http://schemas.microsoft.com/office/drawing/2016/5/13/chartex" xmlns:cx8="http://schemas.microsoft.com/office/drawing/2016/5/14/chartex" xmlns:mc="http://schemas.openxmlformats.org/markup-compatibility/2006" xmlns:aink="http://schemas.microsoft.com/office/drawing/2016/ink" xmlns:am3d="http://schemas.microsoft.com/office/drawing/2017/model3d" xmlns:o="urn:schemas-microsoft-com:office:office" xmlns:oel="http://schemas.microsoft.com/office/2019/extlst" xmlns:r="http://schemas.openxmlformats.org/officeDocument/2006/relationships" xmlns:m="http://schemas.openxmlformats.org/officeDocument/2006/math" xmlns:v="urn:schemas-microsoft-com:vml" xmlns:wp14="http://schemas.microsoft.com/office/word/2010/wordprocessingDrawing" xmlns:wp="http://schemas.openxmlformats.org/drawingml/2006/wordprocessingDrawing" xmlns:w10="urn:schemas-microsoft-com:office:word" xmlns:w="http://schemas.openxmlformats.org/wordprocessingml/2006/main" xmlns:w14="http://schemas.microsoft.com/office/word/2010/wordml" xmlns:w15="http://schemas.microsoft.com/office/word/2012/wordml" xmlns:w16cex="http://schemas.microsoft.com/office/word/2018/wordml/cex" xmlns:w16cid="http://schemas.microsoft.com/office/word/2016/wordml/cid" xmlns:w16="http://schemas.microsoft.com/office/word/2018/wordml" xmlns:w16du="http://schemas.microsoft.com/office/word/2023/wordml/word16du" xmlns:w16sdtdh="http://schemas.microsoft.com/office/word/2020/wordml/sdtdatahash" xmlns:w16sdtfl="http://schemas.microsoft.com/office/word/2024/wordml/sdtformatlock" xmlns:w16se="http://schemas.microsoft.com/office/word/2015/wordml/symex" xmlns:wpg="http://schemas.microsoft.com/office/word/2010/wordprocessingGroup" xmlns:wpi="http://schemas.microsoft.com/office/word/2010/wordprocessingInk" xmlns:wne="http://schemas.microsoft.com/office/word/2006/wordml" xmlns:wps="http://schemas.microsoft.com/office/word/2010/wordprocessingShape" mc:Ignorable="w14 w15 w16se w16cid w16 w16cex w16sdtdh w16sdtfl w16du wp14">
   <w:footnote w:type="separator" w:id="-1">
@@ -2896,6 +2954,16 @@
 
 <file path=word/header1.xml><?xml version="1.0" encoding="utf-8"?>
 <w:hdr xmlns:wpc="http://schemas.microsoft.com/office/word/2010/wordprocessingCanvas" xmlns:cx="http://schemas.microsoft.com/office/drawing/2014/chartex" xmlns:cx1="http://schemas.microsoft.com/office/drawing/2015/9/8/chartex" xmlns:cx2="http://schemas.microsoft.com/office/drawing/2015/10/21/chartex" xmlns:cx3="http://schemas.microsoft.com/office/drawing/2016/5/9/chartex" xmlns:cx4="http://schemas.microsoft.com/office/drawing/2016/5/10/chartex" xmlns:cx5="http://schemas.microsoft.com/office/drawing/2016/5/11/chartex" xmlns:cx6="http://schemas.microsoft.com/office/drawing/2016/5/12/chartex" xmlns:cx7="http://schemas.microsoft.com/office/drawing/2016/5/13/chartex" xmlns:cx8="http://schemas.microsoft.com/office/drawing/2016/5/14/chartex" xmlns:mc="http://schemas.openxmlformats.org/markup-compatibility/2006" xmlns:aink="http://schemas.microsoft.com/office/drawing/2016/ink" xmlns:am3d="http://schemas.microsoft.com/office/drawing/2017/model3d" xmlns:o="urn:schemas-microsoft-com:office:office" xmlns:oel="http://schemas.microsoft.com/office/2019/extlst" xmlns:r="http://schemas.openxmlformats.org/officeDocument/2006/relationships" xmlns:m="http://schemas.openxmlformats.org/officeDocument/2006/math" xmlns:v="urn:schemas-microsoft-com:vml" xmlns:wp14="http://schemas.microsoft.com/office/word/2010/wordprocessingDrawing" xmlns:wp="http://schemas.openxmlformats.org/drawingml/2006/wordprocessingDrawing" xmlns:w10="urn:schemas-microsoft-com:office:word" xmlns:w="http://schemas.openxmlformats.org/wordprocessingml/2006/main" xmlns:w14="http://schemas.microsoft.com/office/word/2010/wordml" xmlns:w15="http://schemas.microsoft.com/office/word/2012/wordml" xmlns:w16cex="http://schemas.microsoft.com/office/word/2018/wordml/cex" xmlns:w16cid="http://schemas.microsoft.com/office/word/2016/wordml/cid" xmlns:w16="http://schemas.microsoft.com/office/word/2018/wordml" xmlns:w16du="http://schemas.microsoft.com/office/word/2023/wordml/word16du" xmlns:w16sdtdh="http://schemas.microsoft.com/office/word/2020/wordml/sdtdatahash" xmlns:w16sdtfl="http://schemas.microsoft.com/office/word/2024/wordml/sdtformatlock" xmlns:w16se="http://schemas.microsoft.com/office/word/2015/wordml/symex" xmlns:wpg="http://schemas.microsoft.com/office/word/2010/wordprocessingGroup" xmlns:wpi="http://schemas.microsoft.com/office/word/2010/wordprocessingInk" xmlns:wne="http://schemas.microsoft.com/office/word/2006/wordml" xmlns:wps="http://schemas.microsoft.com/office/word/2010/wordprocessingShape" mc:Ignorable="w14 w15 w16se w16cid w16 w16cex w16sdtdh w16sdtfl w16du wp14">
+  <w:p>
+    <w:pPr>
+      <w:pStyle w:val="Encabezado"/>
+    </w:pPr>
+  </w:p>
+</w:hdr>
+</file>
+
+<file path=word/header2.xml><?xml version="1.0" encoding="utf-8"?>
+<w:hdr xmlns:wpc="http://schemas.microsoft.com/office/word/2010/wordprocessingCanvas" xmlns:cx="http://schemas.microsoft.com/office/drawing/2014/chartex" xmlns:cx1="http://schemas.microsoft.com/office/drawing/2015/9/8/chartex" xmlns:cx2="http://schemas.microsoft.com/office/drawing/2015/10/21/chartex" xmlns:cx3="http://schemas.microsoft.com/office/drawing/2016/5/9/chartex" xmlns:cx4="http://schemas.microsoft.com/office/drawing/2016/5/10/chartex" xmlns:cx5="http://schemas.microsoft.com/office/drawing/2016/5/11/chartex" xmlns:cx6="http://schemas.microsoft.com/office/drawing/2016/5/12/chartex" xmlns:cx7="http://schemas.microsoft.com/office/drawing/2016/5/13/chartex" xmlns:cx8="http://schemas.microsoft.com/office/drawing/2016/5/14/chartex" xmlns:mc="http://schemas.openxmlformats.org/markup-compatibility/2006" xmlns:aink="http://schemas.microsoft.com/office/drawing/2016/ink" xmlns:am3d="http://schemas.microsoft.com/office/drawing/2017/model3d" xmlns:o="urn:schemas-microsoft-com:office:office" xmlns:oel="http://schemas.microsoft.com/office/2019/extlst" xmlns:r="http://schemas.openxmlformats.org/officeDocument/2006/relationships" xmlns:m="http://schemas.openxmlformats.org/officeDocument/2006/math" xmlns:v="urn:schemas-microsoft-com:vml" xmlns:wp14="http://schemas.microsoft.com/office/word/2010/wordprocessingDrawing" xmlns:wp="http://schemas.openxmlformats.org/drawingml/2006/wordprocessingDrawing" xmlns:w10="urn:schemas-microsoft-com:office:word" xmlns:w="http://schemas.openxmlformats.org/wordprocessingml/2006/main" xmlns:w14="http://schemas.microsoft.com/office/word/2010/wordml" xmlns:w15="http://schemas.microsoft.com/office/word/2012/wordml" xmlns:w16cex="http://schemas.microsoft.com/office/word/2018/wordml/cex" xmlns:w16cid="http://schemas.microsoft.com/office/word/2016/wordml/cid" xmlns:w16="http://schemas.microsoft.com/office/word/2018/wordml" xmlns:w16du="http://schemas.microsoft.com/office/word/2023/wordml/word16du" xmlns:w16sdtdh="http://schemas.microsoft.com/office/word/2020/wordml/sdtdatahash" xmlns:w16sdtfl="http://schemas.microsoft.com/office/word/2024/wordml/sdtformatlock" xmlns:w16se="http://schemas.microsoft.com/office/word/2015/wordml/symex" xmlns:wpg="http://schemas.microsoft.com/office/word/2010/wordprocessingGroup" xmlns:wpi="http://schemas.microsoft.com/office/word/2010/wordprocessingInk" xmlns:wne="http://schemas.microsoft.com/office/word/2006/wordml" xmlns:wps="http://schemas.microsoft.com/office/word/2010/wordprocessingShape" mc:Ignorable="w14 w15 w16se w16cid w16 w16cex w16sdtdh w16sdtfl w16du wp14">
   <w:sdt>
     <w:sdtPr>
       <w:id w:val="-971666797"/>
@@ -2904,6 +2972,12 @@
         <w:docPartUnique/>
       </w:docPartObj>
     </w:sdtPr>
+    <w:sdtEndPr>
+      <w:rPr>
+        <w:sz w:val="20"/>
+        <w:szCs w:val="20"/>
+      </w:rPr>
+    </w:sdtEndPr>
     <w:sdtContent>
       <w:p>
         <w:pPr>
@@ -2915,14 +2989,16 @@
             <w:b/>
             <w:bCs/>
             <w:color w:val="auto"/>
-            <w:sz w:val="12"/>
-            <w:szCs w:val="12"/>
+            <w:sz w:val="20"/>
+            <w:szCs w:val="20"/>
             <w:lang w:val="en-US"/>
           </w:rPr>
         </w:pPr>
         <w:r>
           <w:rPr>
             <w:noProof/>
+            <w:sz w:val="20"/>
+            <w:szCs w:val="20"/>
           </w:rPr>
           <w:drawing>
             <wp:anchor distT="0" distB="5080" distL="0" distR="0" simplePos="0" relativeHeight="5" behindDoc="1" locked="0" layoutInCell="1" allowOverlap="1" wp14:anchorId="66026393" wp14:editId="2888FC45">
@@ -2971,12 +3047,18 @@
         </w:r>
         <w:r>
           <w:rPr>
+            <w:lang w:val="en-US"/>
+          </w:rPr>
+          <w:t xml:space="preserve">         </w:t>
+        </w:r>
+        <w:r>
+          <w:rPr>
             <w:rFonts w:asciiTheme="minorHAnsi" w:hAnsiTheme="minorHAnsi"/>
             <w:b/>
             <w:bCs/>
             <w:color w:val="auto"/>
-            <w:sz w:val="12"/>
-            <w:szCs w:val="12"/>
+            <w:sz w:val="20"/>
+            <w:szCs w:val="20"/>
             <w:lang w:val="en-US"/>
           </w:rPr>
           <w:t>{{CLIENT_NAME}}</w:t>
@@ -2988,31 +3070,11 @@
           <w:spacing w:before="0" w:after="0" w:line="240" w:lineRule="auto"/>
           <w:ind w:left="-630"/>
           <w:rPr>
+            <w:b/>
+            <w:bCs/>
             <w:color w:val="auto"/>
-            <w:sz w:val="12"/>
-            <w:szCs w:val="12"/>
-            <w:lang w:val="en-US"/>
-          </w:rPr>
-        </w:pPr>
-        <w:r>
-          <w:rPr>
-            <w:color w:val="auto"/>
-            <w:sz w:val="12"/>
-            <w:szCs w:val="12"/>
-            <w:lang w:val="en-US"/>
-          </w:rPr>
-          <w:t>{{CLIENT_ADDRESS}}</w:t>
-        </w:r>
-      </w:p>
-      <w:p>
-        <w:pPr>
-          <w:pStyle w:val="Ttulo1"/>
-          <w:spacing w:before="0" w:after="0" w:line="240" w:lineRule="auto"/>
-          <w:ind w:left="-630"/>
-          <w:rPr>
-            <w:color w:val="auto"/>
-            <w:sz w:val="12"/>
-            <w:szCs w:val="12"/>
+            <w:sz w:val="20"/>
+            <w:szCs w:val="20"/>
             <w:lang w:val="en-US"/>
           </w:rPr>
         </w:pPr>
@@ -3021,8 +3083,93 @@
             <w:b/>
             <w:bCs/>
             <w:color w:val="auto"/>
-            <w:sz w:val="12"/>
-            <w:szCs w:val="12"/>
+            <w:sz w:val="20"/>
+            <w:szCs w:val="20"/>
+            <w:lang w:val="en-US"/>
+          </w:rPr>
+          <w:t xml:space="preserve">                  Event Details</w:t>
+        </w:r>
+        <w:r>
+          <w:rPr>
+            <w:b/>
+            <w:bCs/>
+            <w:color w:val="auto"/>
+            <w:sz w:val="20"/>
+            <w:szCs w:val="20"/>
+            <w:lang w:val="en-US"/>
+          </w:rPr>
+          <w:br/>
+        </w:r>
+        <w:r>
+          <w:rPr>
+            <w:b/>
+            <w:bCs/>
+            <w:color w:val="auto"/>
+            <w:sz w:val="20"/>
+            <w:szCs w:val="20"/>
+            <w:lang w:val="en-US"/>
+          </w:rPr>
+          <w:tab/>
+        </w:r>
+        <w:r>
+          <w:rPr>
+            <w:color w:val="auto"/>
+            <w:sz w:val="20"/>
+            <w:szCs w:val="20"/>
+            <w:lang w:val="en-US"/>
+          </w:rPr>
+          <w:t xml:space="preserve"> {{EVENT_NAME}}</w:t>
+        </w:r>
+        <w:r>
+          <w:rPr>
+            <w:color w:val="auto"/>
+            <w:sz w:val="20"/>
+            <w:szCs w:val="20"/>
+            <w:lang w:val="en-US"/>
+          </w:rPr>
+          <w:br/>
+        </w:r>
+        <w:r>
+          <w:rPr>
+            <w:color w:val="auto"/>
+            <w:sz w:val="20"/>
+            <w:szCs w:val="20"/>
+            <w:lang w:val="en-US"/>
+          </w:rPr>
+          <w:tab/>
+          <w:t xml:space="preserve"> {{EVENT_ADDRESS}}</w:t>
+        </w:r>
+      </w:p>
+      <w:p>
+        <w:pPr>
+          <w:pStyle w:val="Ttulo1"/>
+          <w:spacing w:before="0" w:after="0" w:line="240" w:lineRule="auto"/>
+          <w:ind w:left="-630" w:firstLine="630"/>
+          <w:rPr>
+            <w:color w:val="auto"/>
+            <w:sz w:val="20"/>
+            <w:szCs w:val="20"/>
+            <w:lang w:val="en-US"/>
+          </w:rPr>
+        </w:pPr>
+        <w:r>
+          <w:rPr>
+            <w:b/>
+            <w:bCs/>
+            <w:color w:val="auto"/>
+            <w:sz w:val="20"/>
+            <w:szCs w:val="20"/>
+            <w:lang w:val="en-US"/>
+          </w:rPr>
+          <w:t xml:space="preserve"> </w:t>
+        </w:r>
+        <w:r>
+          <w:rPr>
+            <w:b/>
+            <w:bCs/>
+            <w:color w:val="auto"/>
+            <w:sz w:val="20"/>
+            <w:szCs w:val="20"/>
             <w:lang w:val="en-US"/>
           </w:rPr>
           <w:t xml:space="preserve">Client Representative: </w:t>
@@ -3030,8 +3177,8 @@
         <w:r>
           <w:rPr>
             <w:color w:val="auto"/>
-            <w:sz w:val="12"/>
-            <w:szCs w:val="12"/>
+            <w:sz w:val="20"/>
+            <w:szCs w:val="20"/>
             <w:lang w:val="en-US"/>
           </w:rPr>
           <w:t>{{REPRESENTATIVE_NAME}}</w:t>
@@ -3044,16 +3191,25 @@
           <w:ind w:left="-630"/>
           <w:rPr>
             <w:color w:val="auto"/>
-            <w:sz w:val="12"/>
-            <w:szCs w:val="12"/>
+            <w:sz w:val="20"/>
+            <w:szCs w:val="20"/>
             <w:lang w:val="en-US"/>
           </w:rPr>
         </w:pPr>
         <w:r>
           <w:rPr>
             <w:color w:val="auto"/>
-            <w:sz w:val="12"/>
-            <w:szCs w:val="12"/>
+            <w:sz w:val="20"/>
+            <w:szCs w:val="20"/>
+            <w:lang w:val="en-US"/>
+          </w:rPr>
+          <w:t xml:space="preserve">                  </w:t>
+        </w:r>
+        <w:r>
+          <w:rPr>
+            <w:color w:val="auto"/>
+            <w:sz w:val="20"/>
+            <w:szCs w:val="20"/>
             <w:lang w:val="en-US"/>
           </w:rPr>
           <w:t xml:space="preserve">{{REPRESENTATIVE_EMAIL}} </w:t>
@@ -3066,16 +3222,25 @@
           <w:ind w:left="-630"/>
           <w:rPr>
             <w:color w:val="auto"/>
-            <w:sz w:val="12"/>
-            <w:szCs w:val="12"/>
+            <w:sz w:val="20"/>
+            <w:szCs w:val="20"/>
             <w:lang w:val="en-US"/>
           </w:rPr>
         </w:pPr>
         <w:r>
           <w:rPr>
             <w:color w:val="auto"/>
-            <w:sz w:val="12"/>
-            <w:szCs w:val="12"/>
+            <w:sz w:val="20"/>
+            <w:szCs w:val="20"/>
+            <w:lang w:val="en-US"/>
+          </w:rPr>
+          <w:t xml:space="preserve">                  </w:t>
+        </w:r>
+        <w:r>
+          <w:rPr>
+            <w:color w:val="auto"/>
+            <w:sz w:val="20"/>
+            <w:szCs w:val="20"/>
             <w:lang w:val="en-US"/>
           </w:rPr>
           <w:t>Ph: {{REPRESENTATIVE_PHONE}}</w:t>
@@ -3088,8 +3253,8 @@
           <w:ind w:left="-630"/>
           <w:rPr>
             <w:color w:val="auto"/>
-            <w:sz w:val="12"/>
-            <w:szCs w:val="12"/>
+            <w:sz w:val="20"/>
+            <w:szCs w:val="20"/>
             <w:lang w:val="en-US"/>
           </w:rPr>
         </w:pPr>
@@ -3098,8 +3263,19 @@
             <w:b/>
             <w:bCs/>
             <w:color w:val="auto"/>
-            <w:sz w:val="12"/>
-            <w:szCs w:val="12"/>
+            <w:sz w:val="20"/>
+            <w:szCs w:val="20"/>
+            <w:lang w:val="en-US"/>
+          </w:rPr>
+          <w:t xml:space="preserve">                  </w:t>
+        </w:r>
+        <w:r>
+          <w:rPr>
+            <w:b/>
+            <w:bCs/>
+            <w:color w:val="auto"/>
+            <w:sz w:val="20"/>
+            <w:szCs w:val="20"/>
             <w:lang w:val="en-US"/>
           </w:rPr>
           <w:t>Start:</w:t>
@@ -3107,8 +3283,8 @@
         <w:r>
           <w:rPr>
             <w:color w:val="auto"/>
-            <w:sz w:val="12"/>
-            <w:szCs w:val="12"/>
+            <w:sz w:val="20"/>
+            <w:szCs w:val="20"/>
             <w:lang w:val="en-US"/>
           </w:rPr>
           <w:t xml:space="preserve"> {{EVENT_START}}</w:t>
@@ -3121,8 +3297,8 @@
           <w:ind w:left="-630"/>
           <w:rPr>
             <w:color w:val="auto"/>
-            <w:sz w:val="12"/>
-            <w:szCs w:val="12"/>
+            <w:sz w:val="20"/>
+            <w:szCs w:val="20"/>
             <w:lang w:val="en-US"/>
           </w:rPr>
         </w:pPr>
@@ -3131,8 +3307,19 @@
             <w:b/>
             <w:bCs/>
             <w:color w:val="auto"/>
-            <w:sz w:val="12"/>
-            <w:szCs w:val="12"/>
+            <w:sz w:val="20"/>
+            <w:szCs w:val="20"/>
+            <w:lang w:val="en-US"/>
+          </w:rPr>
+          <w:t xml:space="preserve">                  </w:t>
+        </w:r>
+        <w:r>
+          <w:rPr>
+            <w:b/>
+            <w:bCs/>
+            <w:color w:val="auto"/>
+            <w:sz w:val="20"/>
+            <w:szCs w:val="20"/>
             <w:lang w:val="en-US"/>
           </w:rPr>
           <w:t>End:</w:t>
@@ -3140,8 +3327,8 @@
         <w:r>
           <w:rPr>
             <w:color w:val="auto"/>
-            <w:sz w:val="12"/>
-            <w:szCs w:val="12"/>
+            <w:sz w:val="20"/>
+            <w:szCs w:val="20"/>
             <w:lang w:val="en-US"/>
           </w:rPr>
           <w:t xml:space="preserve"> {{EVENT_END}}</w:t>
@@ -3155,8 +3342,8 @@
           <w:rPr>
             <w:rFonts w:asciiTheme="minorHAnsi" w:hAnsiTheme="minorHAnsi"/>
             <w:color w:val="501549" w:themeColor="accent5" w:themeShade="80"/>
-            <w:sz w:val="18"/>
-            <w:szCs w:val="18"/>
+            <w:sz w:val="20"/>
+            <w:szCs w:val="20"/>
             <w:lang w:val="en-US"/>
           </w:rPr>
         </w:pPr>
@@ -3165,8 +3352,19 @@
             <w:b/>
             <w:bCs/>
             <w:color w:val="auto"/>
-            <w:sz w:val="12"/>
-            <w:szCs w:val="12"/>
+            <w:sz w:val="20"/>
+            <w:szCs w:val="20"/>
+            <w:lang w:val="en-US"/>
+          </w:rPr>
+          <w:t xml:space="preserve">                  </w:t>
+        </w:r>
+        <w:r>
+          <w:rPr>
+            <w:b/>
+            <w:bCs/>
+            <w:color w:val="auto"/>
+            <w:sz w:val="20"/>
+            <w:szCs w:val="20"/>
             <w:lang w:val="en-US"/>
           </w:rPr>
           <w:t>Guests</w:t>
@@ -3174,8 +3372,8 @@
         <w:r>
           <w:rPr>
             <w:color w:val="auto"/>
-            <w:sz w:val="12"/>
-            <w:szCs w:val="12"/>
+            <w:sz w:val="20"/>
+            <w:szCs w:val="20"/>
             <w:lang w:val="en-US"/>
           </w:rPr>
           <w:t>: {{EVENT_GUESTS}}</w:t>
@@ -3189,6 +3387,16 @@
       <w:rPr>
         <w:lang w:val="en-US"/>
       </w:rPr>
+    </w:pPr>
+  </w:p>
+</w:hdr>
+</file>
+
+<file path=word/header3.xml><?xml version="1.0" encoding="utf-8"?>
+<w:hdr xmlns:wpc="http://schemas.microsoft.com/office/word/2010/wordprocessingCanvas" xmlns:cx="http://schemas.microsoft.com/office/drawing/2014/chartex" xmlns:cx1="http://schemas.microsoft.com/office/drawing/2015/9/8/chartex" xmlns:cx2="http://schemas.microsoft.com/office/drawing/2015/10/21/chartex" xmlns:cx3="http://schemas.microsoft.com/office/drawing/2016/5/9/chartex" xmlns:cx4="http://schemas.microsoft.com/office/drawing/2016/5/10/chartex" xmlns:cx5="http://schemas.microsoft.com/office/drawing/2016/5/11/chartex" xmlns:cx6="http://schemas.microsoft.com/office/drawing/2016/5/12/chartex" xmlns:cx7="http://schemas.microsoft.com/office/drawing/2016/5/13/chartex" xmlns:cx8="http://schemas.microsoft.com/office/drawing/2016/5/14/chartex" xmlns:mc="http://schemas.openxmlformats.org/markup-compatibility/2006" xmlns:aink="http://schemas.microsoft.com/office/drawing/2016/ink" xmlns:am3d="http://schemas.microsoft.com/office/drawing/2017/model3d" xmlns:o="urn:schemas-microsoft-com:office:office" xmlns:oel="http://schemas.microsoft.com/office/2019/extlst" xmlns:r="http://schemas.openxmlformats.org/officeDocument/2006/relationships" xmlns:m="http://schemas.openxmlformats.org/officeDocument/2006/math" xmlns:v="urn:schemas-microsoft-com:vml" xmlns:wp14="http://schemas.microsoft.com/office/word/2010/wordprocessingDrawing" xmlns:wp="http://schemas.openxmlformats.org/drawingml/2006/wordprocessingDrawing" xmlns:w10="urn:schemas-microsoft-com:office:word" xmlns:w="http://schemas.openxmlformats.org/wordprocessingml/2006/main" xmlns:w14="http://schemas.microsoft.com/office/word/2010/wordml" xmlns:w15="http://schemas.microsoft.com/office/word/2012/wordml" xmlns:w16cex="http://schemas.microsoft.com/office/word/2018/wordml/cex" xmlns:w16cid="http://schemas.microsoft.com/office/word/2016/wordml/cid" xmlns:w16="http://schemas.microsoft.com/office/word/2018/wordml" xmlns:w16du="http://schemas.microsoft.com/office/word/2023/wordml/word16du" xmlns:w16sdtdh="http://schemas.microsoft.com/office/word/2020/wordml/sdtdatahash" xmlns:w16sdtfl="http://schemas.microsoft.com/office/word/2024/wordml/sdtformatlock" xmlns:w16se="http://schemas.microsoft.com/office/word/2015/wordml/symex" xmlns:wpg="http://schemas.microsoft.com/office/word/2010/wordprocessingGroup" xmlns:wpi="http://schemas.microsoft.com/office/word/2010/wordprocessingInk" xmlns:wne="http://schemas.microsoft.com/office/word/2006/wordml" xmlns:wps="http://schemas.microsoft.com/office/word/2010/wordprocessingShape" mc:Ignorable="w14 w15 w16se w16cid w16 w16cex w16sdtdh w16sdtfl w16du wp14">
+  <w:p>
+    <w:pPr>
+      <w:pStyle w:val="Encabezado"/>
     </w:pPr>
   </w:p>
 </w:hdr>

</xml_diff>